<commit_message>
Ajustes de repositorio 1.5
</commit_message>
<xml_diff>
--- a/fuentes/CFA1_135333_DU.docx
+++ b/fuentes/CFA1_135333_DU.docx
@@ -604,7 +604,7 @@
           <w:r>
             <w:fldChar w:fldCharType="separate"/>
           </w:r>
-          <w:hyperlink w:anchor="_Toc229413287" w:history="1">
+          <w:hyperlink w:anchor="_Toc229564280" w:history="1">
             <w:r>
               <w:rPr>
                 <w:rStyle w:val="Hipervnculo"/>
@@ -631,7 +631,7 @@
                 <w:noProof/>
                 <w:webHidden/>
               </w:rPr>
-              <w:instrText xml:space="preserve"> PAGEREF _Toc229413287 \h </w:instrText>
+              <w:instrText xml:space="preserve"> PAGEREF _Toc229564280 \h </w:instrText>
             </w:r>
             <w:r>
               <w:rPr>
@@ -678,7 +678,7 @@
               <w14:ligatures w14:val="none"/>
             </w:rPr>
           </w:pPr>
-          <w:hyperlink w:anchor="_Toc229413288" w:history="1">
+          <w:hyperlink w:anchor="_Toc229564281" w:history="1">
             <w:r>
               <w:rPr>
                 <w:rStyle w:val="Hipervnculo"/>
@@ -723,7 +723,7 @@
                 <w:noProof/>
                 <w:webHidden/>
               </w:rPr>
-              <w:instrText xml:space="preserve"> PAGEREF _Toc229413288 \h </w:instrText>
+              <w:instrText xml:space="preserve"> PAGEREF _Toc229564281 \h </w:instrText>
             </w:r>
             <w:r>
               <w:rPr>
@@ -766,7 +766,7 @@
               <w14:ligatures w14:val="none"/>
             </w:rPr>
           </w:pPr>
-          <w:hyperlink w:anchor="_Toc229413289" w:history="1">
+          <w:hyperlink w:anchor="_Toc229564282" w:history="1">
             <w:r>
               <w:rPr>
                 <w:rStyle w:val="Hipervnculo"/>
@@ -811,7 +811,7 @@
                 <w:noProof/>
                 <w:webHidden/>
               </w:rPr>
-              <w:instrText xml:space="preserve"> PAGEREF _Toc229413289 \h </w:instrText>
+              <w:instrText xml:space="preserve"> PAGEREF _Toc229564282 \h </w:instrText>
             </w:r>
             <w:r>
               <w:rPr>
@@ -858,7 +858,7 @@
               <w14:ligatures w14:val="none"/>
             </w:rPr>
           </w:pPr>
-          <w:hyperlink w:anchor="_Toc229413290" w:history="1">
+          <w:hyperlink w:anchor="_Toc229564283" w:history="1">
             <w:r>
               <w:rPr>
                 <w:rStyle w:val="Hipervnculo"/>
@@ -903,7 +903,7 @@
                 <w:noProof/>
                 <w:webHidden/>
               </w:rPr>
-              <w:instrText xml:space="preserve"> PAGEREF _Toc229413290 \h </w:instrText>
+              <w:instrText xml:space="preserve"> PAGEREF _Toc229564283 \h </w:instrText>
             </w:r>
             <w:r>
               <w:rPr>
@@ -946,7 +946,7 @@
               <w14:ligatures w14:val="none"/>
             </w:rPr>
           </w:pPr>
-          <w:hyperlink w:anchor="_Toc229413291" w:history="1">
+          <w:hyperlink w:anchor="_Toc229564284" w:history="1">
             <w:r>
               <w:rPr>
                 <w:rStyle w:val="Hipervnculo"/>
@@ -991,7 +991,7 @@
                 <w:noProof/>
                 <w:webHidden/>
               </w:rPr>
-              <w:instrText xml:space="preserve"> PAGEREF _Toc229413291 \h </w:instrText>
+              <w:instrText xml:space="preserve"> PAGEREF _Toc229564284 \h </w:instrText>
             </w:r>
             <w:r>
               <w:rPr>
@@ -1034,7 +1034,7 @@
               <w14:ligatures w14:val="none"/>
             </w:rPr>
           </w:pPr>
-          <w:hyperlink w:anchor="_Toc229413292" w:history="1">
+          <w:hyperlink w:anchor="_Toc229564285" w:history="1">
             <w:r>
               <w:rPr>
                 <w:rStyle w:val="Hipervnculo"/>
@@ -1079,7 +1079,7 @@
                 <w:noProof/>
                 <w:webHidden/>
               </w:rPr>
-              <w:instrText xml:space="preserve"> PAGEREF _Toc229413292 \h </w:instrText>
+              <w:instrText xml:space="preserve"> PAGEREF _Toc229564285 \h </w:instrText>
             </w:r>
             <w:r>
               <w:rPr>
@@ -1126,7 +1126,7 @@
               <w14:ligatures w14:val="none"/>
             </w:rPr>
           </w:pPr>
-          <w:hyperlink w:anchor="_Toc229413293" w:history="1">
+          <w:hyperlink w:anchor="_Toc229564286" w:history="1">
             <w:r>
               <w:rPr>
                 <w:rStyle w:val="Hipervnculo"/>
@@ -1171,7 +1171,7 @@
                 <w:noProof/>
                 <w:webHidden/>
               </w:rPr>
-              <w:instrText xml:space="preserve"> PAGEREF _Toc229413293 \h </w:instrText>
+              <w:instrText xml:space="preserve"> PAGEREF _Toc229564286 \h </w:instrText>
             </w:r>
             <w:r>
               <w:rPr>
@@ -1214,7 +1214,7 @@
               <w14:ligatures w14:val="none"/>
             </w:rPr>
           </w:pPr>
-          <w:hyperlink w:anchor="_Toc229413294" w:history="1">
+          <w:hyperlink w:anchor="_Toc229564287" w:history="1">
             <w:r>
               <w:rPr>
                 <w:rStyle w:val="Hipervnculo"/>
@@ -1259,7 +1259,7 @@
                 <w:noProof/>
                 <w:webHidden/>
               </w:rPr>
-              <w:instrText xml:space="preserve"> PAGEREF _Toc229413294 \h </w:instrText>
+              <w:instrText xml:space="preserve"> PAGEREF _Toc229564287 \h </w:instrText>
             </w:r>
             <w:r>
               <w:rPr>
@@ -1302,7 +1302,7 @@
               <w14:ligatures w14:val="none"/>
             </w:rPr>
           </w:pPr>
-          <w:hyperlink w:anchor="_Toc229413295" w:history="1">
+          <w:hyperlink w:anchor="_Toc229564288" w:history="1">
             <w:r>
               <w:rPr>
                 <w:rStyle w:val="Hipervnculo"/>
@@ -1347,7 +1347,7 @@
                 <w:noProof/>
                 <w:webHidden/>
               </w:rPr>
-              <w:instrText xml:space="preserve"> PAGEREF _Toc229413295 \h </w:instrText>
+              <w:instrText xml:space="preserve"> PAGEREF _Toc229564288 \h </w:instrText>
             </w:r>
             <w:r>
               <w:rPr>
@@ -1394,7 +1394,7 @@
               <w14:ligatures w14:val="none"/>
             </w:rPr>
           </w:pPr>
-          <w:hyperlink w:anchor="_Toc229413296" w:history="1">
+          <w:hyperlink w:anchor="_Toc229564289" w:history="1">
             <w:r>
               <w:rPr>
                 <w:rStyle w:val="Hipervnculo"/>
@@ -1439,7 +1439,7 @@
                 <w:noProof/>
                 <w:webHidden/>
               </w:rPr>
-              <w:instrText xml:space="preserve"> PAGEREF _Toc229413296 \h </w:instrText>
+              <w:instrText xml:space="preserve"> PAGEREF _Toc229564289 \h </w:instrText>
             </w:r>
             <w:r>
               <w:rPr>
@@ -1482,7 +1482,7 @@
               <w14:ligatures w14:val="none"/>
             </w:rPr>
           </w:pPr>
-          <w:hyperlink w:anchor="_Toc229413297" w:history="1">
+          <w:hyperlink w:anchor="_Toc229564290" w:history="1">
             <w:r>
               <w:rPr>
                 <w:rStyle w:val="Hipervnculo"/>
@@ -1527,7 +1527,7 @@
                 <w:noProof/>
                 <w:webHidden/>
               </w:rPr>
-              <w:instrText xml:space="preserve"> PAGEREF _Toc229413297 \h </w:instrText>
+              <w:instrText xml:space="preserve"> PAGEREF _Toc229564290 \h </w:instrText>
             </w:r>
             <w:r>
               <w:rPr>
@@ -1570,7 +1570,7 @@
               <w14:ligatures w14:val="none"/>
             </w:rPr>
           </w:pPr>
-          <w:hyperlink w:anchor="_Toc229413298" w:history="1">
+          <w:hyperlink w:anchor="_Toc229564291" w:history="1">
             <w:r>
               <w:rPr>
                 <w:rStyle w:val="Hipervnculo"/>
@@ -1615,7 +1615,7 @@
                 <w:noProof/>
                 <w:webHidden/>
               </w:rPr>
-              <w:instrText xml:space="preserve"> PAGEREF _Toc229413298 \h </w:instrText>
+              <w:instrText xml:space="preserve"> PAGEREF _Toc229564291 \h </w:instrText>
             </w:r>
             <w:r>
               <w:rPr>
@@ -1658,7 +1658,7 @@
               <w14:ligatures w14:val="none"/>
             </w:rPr>
           </w:pPr>
-          <w:hyperlink w:anchor="_Toc229413299" w:history="1">
+          <w:hyperlink w:anchor="_Toc229564292" w:history="1">
             <w:r>
               <w:rPr>
                 <w:rStyle w:val="Hipervnculo"/>
@@ -1703,7 +1703,7 @@
                 <w:noProof/>
                 <w:webHidden/>
               </w:rPr>
-              <w:instrText xml:space="preserve"> PAGEREF _Toc229413299 \h </w:instrText>
+              <w:instrText xml:space="preserve"> PAGEREF _Toc229564292 \h </w:instrText>
             </w:r>
             <w:r>
               <w:rPr>
@@ -1746,7 +1746,7 @@
               <w14:ligatures w14:val="none"/>
             </w:rPr>
           </w:pPr>
-          <w:hyperlink w:anchor="_Toc229413300" w:history="1">
+          <w:hyperlink w:anchor="_Toc229564293" w:history="1">
             <w:r>
               <w:rPr>
                 <w:rStyle w:val="Hipervnculo"/>
@@ -1791,7 +1791,7 @@
                 <w:noProof/>
                 <w:webHidden/>
               </w:rPr>
-              <w:instrText xml:space="preserve"> PAGEREF _Toc229413300 \h </w:instrText>
+              <w:instrText xml:space="preserve"> PAGEREF _Toc229564293 \h </w:instrText>
             </w:r>
             <w:r>
               <w:rPr>
@@ -1838,7 +1838,7 @@
               <w14:ligatures w14:val="none"/>
             </w:rPr>
           </w:pPr>
-          <w:hyperlink w:anchor="_Toc229413301" w:history="1">
+          <w:hyperlink w:anchor="_Toc229564294" w:history="1">
             <w:r>
               <w:rPr>
                 <w:rStyle w:val="Hipervnculo"/>
@@ -1883,7 +1883,7 @@
                 <w:noProof/>
                 <w:webHidden/>
               </w:rPr>
-              <w:instrText xml:space="preserve"> PAGEREF _Toc229413301 \h </w:instrText>
+              <w:instrText xml:space="preserve"> PAGEREF _Toc229564294 \h </w:instrText>
             </w:r>
             <w:r>
               <w:rPr>
@@ -1926,7 +1926,7 @@
               <w14:ligatures w14:val="none"/>
             </w:rPr>
           </w:pPr>
-          <w:hyperlink w:anchor="_Toc229413302" w:history="1">
+          <w:hyperlink w:anchor="_Toc229564295" w:history="1">
             <w:r>
               <w:rPr>
                 <w:rStyle w:val="Hipervnculo"/>
@@ -1971,7 +1971,7 @@
                 <w:noProof/>
                 <w:webHidden/>
               </w:rPr>
-              <w:instrText xml:space="preserve"> PAGEREF _Toc229413302 \h </w:instrText>
+              <w:instrText xml:space="preserve"> PAGEREF _Toc229564295 \h </w:instrText>
             </w:r>
             <w:r>
               <w:rPr>
@@ -2014,7 +2014,7 @@
               <w14:ligatures w14:val="none"/>
             </w:rPr>
           </w:pPr>
-          <w:hyperlink w:anchor="_Toc229413303" w:history="1">
+          <w:hyperlink w:anchor="_Toc229564296" w:history="1">
             <w:r>
               <w:rPr>
                 <w:rStyle w:val="Hipervnculo"/>
@@ -2059,7 +2059,7 @@
                 <w:noProof/>
                 <w:webHidden/>
               </w:rPr>
-              <w:instrText xml:space="preserve"> PAGEREF _Toc229413303 \h </w:instrText>
+              <w:instrText xml:space="preserve"> PAGEREF _Toc229564296 \h </w:instrText>
             </w:r>
             <w:r>
               <w:rPr>
@@ -2105,7 +2105,7 @@
               <w14:ligatures w14:val="none"/>
             </w:rPr>
           </w:pPr>
-          <w:hyperlink w:anchor="_Toc229413304" w:history="1">
+          <w:hyperlink w:anchor="_Toc229564297" w:history="1">
             <w:r>
               <w:rPr>
                 <w:rStyle w:val="Hipervnculo"/>
@@ -2132,7 +2132,7 @@
                 <w:noProof/>
                 <w:webHidden/>
               </w:rPr>
-              <w:instrText xml:space="preserve"> PAGEREF _Toc229413304 \h </w:instrText>
+              <w:instrText xml:space="preserve"> PAGEREF _Toc229564297 \h </w:instrText>
             </w:r>
             <w:r>
               <w:rPr>
@@ -2178,7 +2178,7 @@
               <w14:ligatures w14:val="none"/>
             </w:rPr>
           </w:pPr>
-          <w:hyperlink w:anchor="_Toc229413305" w:history="1">
+          <w:hyperlink w:anchor="_Toc229564298" w:history="1">
             <w:r>
               <w:rPr>
                 <w:rStyle w:val="Hipervnculo"/>
@@ -2205,7 +2205,7 @@
                 <w:noProof/>
                 <w:webHidden/>
               </w:rPr>
-              <w:instrText xml:space="preserve"> PAGEREF _Toc229413305 \h </w:instrText>
+              <w:instrText xml:space="preserve"> PAGEREF _Toc229564298 \h </w:instrText>
             </w:r>
             <w:r>
               <w:rPr>
@@ -2251,7 +2251,7 @@
               <w14:ligatures w14:val="none"/>
             </w:rPr>
           </w:pPr>
-          <w:hyperlink w:anchor="_Toc229413306" w:history="1">
+          <w:hyperlink w:anchor="_Toc229564299" w:history="1">
             <w:r>
               <w:rPr>
                 <w:rStyle w:val="Hipervnculo"/>
@@ -2278,7 +2278,7 @@
                 <w:noProof/>
                 <w:webHidden/>
               </w:rPr>
-              <w:instrText xml:space="preserve"> PAGEREF _Toc229413306 \h </w:instrText>
+              <w:instrText xml:space="preserve"> PAGEREF _Toc229564299 \h </w:instrText>
             </w:r>
             <w:r>
               <w:rPr>
@@ -2324,7 +2324,7 @@
               <w14:ligatures w14:val="none"/>
             </w:rPr>
           </w:pPr>
-          <w:hyperlink w:anchor="_Toc229413307" w:history="1">
+          <w:hyperlink w:anchor="_Toc229564300" w:history="1">
             <w:r>
               <w:rPr>
                 <w:rStyle w:val="Hipervnculo"/>
@@ -2351,7 +2351,7 @@
                 <w:noProof/>
                 <w:webHidden/>
               </w:rPr>
-              <w:instrText xml:space="preserve"> PAGEREF _Toc229413307 \h </w:instrText>
+              <w:instrText xml:space="preserve"> PAGEREF _Toc229564300 \h </w:instrText>
             </w:r>
             <w:r>
               <w:rPr>
@@ -2416,7 +2416,7 @@
       <w:pPr>
         <w:pStyle w:val="Titulosgenerales"/>
       </w:pPr>
-      <w:bookmarkStart w:id="0" w:name="_Toc229413287"/>
+      <w:bookmarkStart w:id="0" w:name="_Toc229564280"/>
       <w:r>
         <w:lastRenderedPageBreak/>
         <w:t>Introducción</w:t>
@@ -2442,10 +2442,19 @@
       <w:r>
         <w:t>Reconocimiento de clientes</w:t>
       </w:r>
-    </w:p>
-    <w:p>
-      <w:r>
-        <w:t xml:space="preserve">       </w:t>
+      <w:r>
+        <w:t>: introducción</w:t>
+      </w:r>
+    </w:p>
+    <w:p>
+      <w:r>
+        <w:t xml:space="preserve">     </w:t>
+      </w:r>
+      <w:r>
+        <w:t xml:space="preserve">   </w:t>
+      </w:r>
+      <w:r>
+        <w:t xml:space="preserve">  </w:t>
       </w:r>
       <w:r>
         <w:rPr>
@@ -2994,7 +3003,7 @@
       <w:pPr>
         <w:pStyle w:val="Ttulo1"/>
       </w:pPr>
-      <w:bookmarkStart w:id="1" w:name="_Toc229413288"/>
+      <w:bookmarkStart w:id="1" w:name="_Toc229564281"/>
       <w:r>
         <w:lastRenderedPageBreak/>
         <w:t>Información</w:t>
@@ -3736,7 +3745,7 @@
       <w:pPr>
         <w:pStyle w:val="Ttulo2"/>
       </w:pPr>
-      <w:bookmarkStart w:id="2" w:name="_Toc229413289"/>
+      <w:bookmarkStart w:id="2" w:name="_Toc229564282"/>
       <w:r>
         <w:lastRenderedPageBreak/>
         <w:t>Tipos de información</w:t>
@@ -4044,7 +4053,7 @@
       <w:pPr>
         <w:pStyle w:val="Ttulo1"/>
       </w:pPr>
-      <w:bookmarkStart w:id="3" w:name="_Toc229413290"/>
+      <w:bookmarkStart w:id="3" w:name="_Toc229564283"/>
       <w:r>
         <w:lastRenderedPageBreak/>
         <w:t>Cliente</w:t>
@@ -4087,10 +4096,10 @@
           <w:noProof/>
         </w:rPr>
         <w:drawing>
-          <wp:inline distT="0" distB="0" distL="0" distR="0" wp14:anchorId="6203E03F" wp14:editId="3CC17440">
-            <wp:extent cx="4603898" cy="2588655"/>
-            <wp:effectExtent l="0" t="0" r="6350" b="2540"/>
-            <wp:docPr id="8" name="Imagen 8">
+          <wp:inline distT="0" distB="0" distL="0" distR="0" wp14:anchorId="5B862DEA" wp14:editId="08D621F3">
+            <wp:extent cx="4529470" cy="2546805"/>
+            <wp:effectExtent l="0" t="0" r="4445" b="6350"/>
+            <wp:docPr id="5" name="Imagen 5">
               <a:extLst xmlns:a="http://schemas.openxmlformats.org/drawingml/2006/main">
                 <a:ext uri="{C183D7F6-B498-43B3-948B-1728B52AA6E4}">
                   <adec:decorative xmlns:adec="http://schemas.microsoft.com/office/drawing/2017/decorative" val="1"/>
@@ -4104,7 +4113,7 @@
               <a:graphicData uri="http://schemas.openxmlformats.org/drawingml/2006/picture">
                 <pic:pic xmlns:pic="http://schemas.openxmlformats.org/drawingml/2006/picture">
                   <pic:nvPicPr>
-                    <pic:cNvPr id="8" name="Imagen 8">
+                    <pic:cNvPr id="5" name="Imagen 5">
                       <a:extLst>
                         <a:ext uri="{C183D7F6-B498-43B3-948B-1728B52AA6E4}">
                           <adec:decorative xmlns:adec="http://schemas.microsoft.com/office/drawing/2017/decorative" val="1"/>
@@ -4131,7 +4140,7 @@
                   <pic:spPr bwMode="auto">
                     <a:xfrm>
                       <a:off x="0" y="0"/>
-                      <a:ext cx="4622988" cy="2599389"/>
+                      <a:ext cx="4539230" cy="2552293"/>
                     </a:xfrm>
                     <a:prstGeom prst="rect">
                       <a:avLst/>
@@ -4414,7 +4423,6 @@
         <w:rPr>
           <w:bCs/>
         </w:rPr>
-        <w:lastRenderedPageBreak/>
         <w:t xml:space="preserve">De acuerdo con lo anterior, se podrían resumir las expectativas mínimas que tienen los clientes </w:t>
       </w:r>
       <w:r>
@@ -4745,6 +4753,9 @@
     </w:p>
     <w:p>
       <w:r>
+        <w:t xml:space="preserve">    </w:t>
+      </w:r>
+      <w:r>
         <w:t xml:space="preserve">        </w:t>
       </w:r>
       <w:r>
@@ -4752,10 +4763,10 @@
           <w:noProof/>
         </w:rPr>
         <w:drawing>
-          <wp:inline distT="0" distB="0" distL="0" distR="0" wp14:anchorId="6598B279" wp14:editId="1355C004">
-            <wp:extent cx="4710224" cy="2648438"/>
+          <wp:inline distT="0" distB="0" distL="0" distR="0" wp14:anchorId="62AE20DE" wp14:editId="0EBDDDE2">
+            <wp:extent cx="4273639" cy="2402958"/>
             <wp:effectExtent l="0" t="0" r="0" b="0"/>
-            <wp:docPr id="9" name="Imagen 9">
+            <wp:docPr id="21" name="Imagen 21">
               <a:extLst xmlns:a="http://schemas.openxmlformats.org/drawingml/2006/main">
                 <a:ext uri="{C183D7F6-B498-43B3-948B-1728B52AA6E4}">
                   <adec:decorative xmlns:adec="http://schemas.microsoft.com/office/drawing/2017/decorative" val="1"/>
@@ -4769,7 +4780,7 @@
               <a:graphicData uri="http://schemas.openxmlformats.org/drawingml/2006/picture">
                 <pic:pic xmlns:pic="http://schemas.openxmlformats.org/drawingml/2006/picture">
                   <pic:nvPicPr>
-                    <pic:cNvPr id="9" name="Imagen 9">
+                    <pic:cNvPr id="21" name="Imagen 21">
                       <a:extLst>
                         <a:ext uri="{C183D7F6-B498-43B3-948B-1728B52AA6E4}">
                           <adec:decorative xmlns:adec="http://schemas.microsoft.com/office/drawing/2017/decorative" val="1"/>
@@ -4796,7 +4807,7 @@
                   <pic:spPr bwMode="auto">
                     <a:xfrm>
                       <a:off x="0" y="0"/>
-                      <a:ext cx="4715082" cy="2651170"/>
+                      <a:ext cx="4288629" cy="2411386"/>
                     </a:xfrm>
                     <a:prstGeom prst="rect">
                       <a:avLst/>
@@ -4816,6 +4827,9 @@
     <w:p>
       <w:r>
         <w:t xml:space="preserve">        </w:t>
+      </w:r>
+      <w:r>
+        <w:t xml:space="preserve">  </w:t>
       </w:r>
       <w:r>
         <w:t xml:space="preserve">Video: </w:t>
@@ -4980,11 +4994,7 @@
           </w:p>
           <w:p>
             <w:r>
-              <w:t xml:space="preserve">Dos, cliente y consumidor al mismo tiempo, Ana Teresa a través de una página web compra unos zapatos para una fiesta, en este caso Ana es la cliente porque fue </w:t>
-            </w:r>
-            <w:r>
-              <w:lastRenderedPageBreak/>
-              <w:t xml:space="preserve">quien pagó por los zapatos y al mismo tiempo es la consumidora </w:t>
+              <w:t xml:space="preserve">Dos, cliente y consumidor al mismo tiempo, Ana Teresa a través de una página web compra unos zapatos para una fiesta, en este caso Ana es la cliente porque fue quien pagó por los zapatos y al mismo tiempo es la consumidora </w:t>
             </w:r>
             <w:proofErr w:type="spellStart"/>
             <w:r>
@@ -5000,6 +5010,7 @@
           </w:p>
           <w:p>
             <w:r>
+              <w:lastRenderedPageBreak/>
               <w:t>Aquí se debe tener presente el concepto de consumidor no solo hace alusión a productos que se consumen</w:t>
             </w:r>
             <w:r>
@@ -5120,40 +5131,39 @@
         <w:rPr>
           <w:bCs/>
         </w:rPr>
+        <w:t xml:space="preserve">Hay un interrogante que es frecuente cuando se están analizando a los clientes, el cual es: ¿las necesidades de los clientes ya están creadas o se deben crear?, la respuesta es simple: las necesidades ya existen; por esto, las empresas crean o comercializan bienes o servicios, para satisfacer las necesidades de los clientes de la mejor </w:t>
+      </w:r>
+      <w:r>
+        <w:rPr>
+          <w:bCs/>
+        </w:rPr>
+        <w:t xml:space="preserve">manera </w:t>
+      </w:r>
+      <w:r>
+        <w:rPr>
+          <w:bCs/>
+        </w:rPr>
+        <w:t>posible.</w:t>
+      </w:r>
+    </w:p>
+    <w:p>
+      <w:pPr>
+        <w:rPr>
+          <w:bCs/>
+        </w:rPr>
+      </w:pPr>
+      <w:r>
+        <w:rPr>
+          <w:bCs/>
+        </w:rPr>
+        <w:t xml:space="preserve">Para dar mayor estructura a la premisa anterior, hacia 1943 Abraham Maslow, en su libro: Teoría de la Motivación Humana, formuló uno de los aportes más relevantes para la historia asociado al comportamiento humano, la pirámide de Maslow. En ella se establece que todas las personas tienen diferentes niveles de necesidades y en la medida en que las más básicas se van cubriendo el ser humano propenderá por ir avanzando en la pirámide y alcanzar las siguientes. Para mayor entendimiento, se </w:t>
+      </w:r>
+      <w:r>
+        <w:rPr>
+          <w:bCs/>
+        </w:rPr>
         <w:lastRenderedPageBreak/>
-        <w:t xml:space="preserve">Hay un interrogante que es frecuente cuando se están analizando a los clientes, el cual es: ¿las necesidades de los clientes ya están creadas o se deben crear?, la respuesta es simple: las necesidades ya existen; por esto, las empresas crean o comercializan bienes o servicios, para satisfacer las necesidades de los clientes de la mejor </w:t>
-      </w:r>
-      <w:r>
-        <w:rPr>
-          <w:bCs/>
-        </w:rPr>
-        <w:t xml:space="preserve">manera </w:t>
-      </w:r>
-      <w:r>
-        <w:rPr>
-          <w:bCs/>
-        </w:rPr>
-        <w:t>posible.</w:t>
-      </w:r>
-    </w:p>
-    <w:p>
-      <w:pPr>
-        <w:rPr>
-          <w:bCs/>
-        </w:rPr>
-      </w:pPr>
-      <w:r>
-        <w:rPr>
-          <w:bCs/>
-        </w:rPr>
-        <w:t xml:space="preserve">Para dar mayor estructura a la premisa anterior, hacia 1943 Abraham Maslow, en su libro: Teoría de la Motivación Humana, formuló uno de los aportes más relevantes para la historia asociado al comportamiento humano, la pirámide de Maslow. En ella se </w:t>
-      </w:r>
-      <w:r>
-        <w:rPr>
-          <w:bCs/>
-        </w:rPr>
-        <w:lastRenderedPageBreak/>
-        <w:t>establece que todas las personas tienen diferentes niveles de necesidades y en la medida en que las más básicas se van cubriendo el ser humano propenderá por ir avanzando en la pirámide y alcanzar las siguientes. Para mayor entendimiento, se detalla a continuación la clasificación de las necesidades que se identifican en la pirámide de Maslow.</w:t>
+        <w:t>detalla a continuación la clasificación de las necesidades que se identifican en la pirámide de Maslow.</w:t>
       </w:r>
     </w:p>
     <w:p>
@@ -5266,7 +5276,7 @@
       <w:pPr>
         <w:pStyle w:val="Ttulo2"/>
       </w:pPr>
-      <w:bookmarkStart w:id="4" w:name="_Toc229413291"/>
+      <w:bookmarkStart w:id="4" w:name="_Toc229564284"/>
       <w:r>
         <w:t>Clasificación</w:t>
       </w:r>
@@ -5339,7 +5349,6 @@
         <w:rPr>
           <w:lang w:val="es-419" w:eastAsia="es-CO"/>
         </w:rPr>
-        <w:lastRenderedPageBreak/>
         <w:t>A partir del volumen de compra.</w:t>
       </w:r>
     </w:p>
@@ -5371,6 +5380,7 @@
         <w:rPr>
           <w:lang w:val="es-419" w:eastAsia="es-CO"/>
         </w:rPr>
+        <w:lastRenderedPageBreak/>
         <w:t>Nota: pueden existir más tipos de clasificación que tengan en cuenta otras características.</w:t>
       </w:r>
     </w:p>
@@ -5534,14 +5544,14 @@
         <w:rPr>
           <w:lang w:val="es-419" w:eastAsia="es-CO"/>
         </w:rPr>
-        <w:t xml:space="preserve">Son los que están por fuera de la empresa y se ven influenciados por ella, son relevantes porque son los que generan principalmente los ingresos a la empresa. El cliente externo, por excelencia, es aquel que le compra los productos a la empresa, sin embargo, en sentido técnico clientes externos también son: los proveedores, los </w:t>
+        <w:t xml:space="preserve">Son los que están por fuera de la empresa y se ven influenciados por ella, son relevantes porque son los que generan principalmente los ingresos a la empresa. El cliente externo, por excelencia, es aquel que le compra los productos a la empresa, sin embargo, en sentido técnico clientes externos también son: los proveedores, los distribuidores, el Estado, los entes de vigilancia, reguladores y de control y en general la </w:t>
       </w:r>
       <w:r>
         <w:rPr>
           <w:lang w:val="es-419" w:eastAsia="es-CO"/>
         </w:rPr>
         <w:lastRenderedPageBreak/>
-        <w:t>distribuidores, el Estado, los entes de vigilancia, reguladores y de control y en general la sociedad en general, quienes están siempre pendientes del impacto de las acciones de las empresas en el entorno.</w:t>
+        <w:t>sociedad en general, quienes están siempre pendientes del impacto de las acciones de las empresas en el entorno.</w:t>
       </w:r>
     </w:p>
     <w:p>
@@ -5746,7 +5756,6 @@
         <w:rPr>
           <w:lang w:val="es-419" w:eastAsia="es-CO"/>
         </w:rPr>
-        <w:lastRenderedPageBreak/>
         <w:t>Requieren del bien</w:t>
       </w:r>
       <w:r>
@@ -5777,6 +5786,7 @@
         <w:rPr>
           <w:lang w:val="es-419" w:eastAsia="es-CO"/>
         </w:rPr>
+        <w:lastRenderedPageBreak/>
         <w:t>Tienen poder adquisitivo (dinero o medios de pago) para comprarlo.</w:t>
       </w:r>
     </w:p>
@@ -6063,21 +6073,7 @@
         <w:rPr>
           <w:lang w:val="es-419" w:eastAsia="es-CO"/>
         </w:rPr>
-        <w:t xml:space="preserve">Son aquellos que realizaron compras hace bastante tiempo </w:t>
-      </w:r>
-      <w:proofErr w:type="gramStart"/>
-      <w:r>
-        <w:rPr>
-          <w:lang w:val="es-419" w:eastAsia="es-CO"/>
-        </w:rPr>
-        <w:t>y</w:t>
-      </w:r>
-      <w:proofErr w:type="gramEnd"/>
-      <w:r>
-        <w:rPr>
-          <w:lang w:val="es-419" w:eastAsia="es-CO"/>
-        </w:rPr>
-        <w:t xml:space="preserve"> por tanto, ya no tienen relación comercial con la empresa, por lo que se infiere que están adquiriendo los productos con la competencia o que dejaron de utilizar el bien</w:t>
+        <w:t>Son aquellos que realizaron compras hace bastante tiempo y por tanto, ya no tienen relación comercial con la empresa, por lo que se infiere que están adquiriendo los productos con la competencia o que dejaron de utilizar el bien</w:t>
       </w:r>
       <w:r>
         <w:rPr>
@@ -6496,7 +6492,7 @@
       <w:pPr>
         <w:pStyle w:val="Ttulo2"/>
       </w:pPr>
-      <w:bookmarkStart w:id="5" w:name="_Toc229413292"/>
+      <w:bookmarkStart w:id="5" w:name="_Toc229564285"/>
       <w:r>
         <w:t>Tipología y manejo del cliente</w:t>
       </w:r>
@@ -6554,21 +6550,7 @@
         <w:rPr>
           <w:lang w:val="es-419" w:eastAsia="es-CO"/>
         </w:rPr>
-        <w:t xml:space="preserve">El cliente informado es aquel que se caracteriza por tener mucho conocimiento sobre el producto que está requiriendo, por tanto, está pendiente de cada detalle </w:t>
-      </w:r>
-      <w:proofErr w:type="gramStart"/>
-      <w:r>
-        <w:rPr>
-          <w:lang w:val="es-419" w:eastAsia="es-CO"/>
-        </w:rPr>
-        <w:t>y</w:t>
-      </w:r>
-      <w:proofErr w:type="gramEnd"/>
-      <w:r>
-        <w:rPr>
-          <w:lang w:val="es-419" w:eastAsia="es-CO"/>
-        </w:rPr>
-        <w:t xml:space="preserve"> por tanto, indaga mucho, sus preguntas se caracterizan por ser analíticas y profundas.</w:t>
+        <w:t>El cliente informado es aquel que se caracteriza por tener mucho conocimiento sobre el producto que está requiriendo, por tanto, está pendiente de cada detalle y por tanto, indaga mucho, sus preguntas se caracterizan por ser analíticas y profundas.</w:t>
       </w:r>
     </w:p>
     <w:p>
@@ -7602,7 +7584,7 @@
       <w:pPr>
         <w:pStyle w:val="Ttulo1"/>
       </w:pPr>
-      <w:bookmarkStart w:id="6" w:name="_Toc229413293"/>
+      <w:bookmarkStart w:id="6" w:name="_Toc229564286"/>
       <w:r>
         <w:lastRenderedPageBreak/>
         <w:t>Inclusión</w:t>
@@ -7638,16 +7620,8 @@
         <w:rPr>
           <w:lang w:val="es-419" w:eastAsia="es-CO"/>
         </w:rPr>
-        <w:t xml:space="preserve">a </w:t>
-      </w:r>
-      <w:proofErr w:type="gramStart"/>
-      <w:r>
-        <w:rPr>
-          <w:lang w:val="es-419" w:eastAsia="es-CO"/>
-        </w:rPr>
-        <w:t>continuación</w:t>
-      </w:r>
-      <w:proofErr w:type="gramEnd"/>
+        <w:t>a continuación</w:t>
+      </w:r>
       <w:r>
         <w:rPr>
           <w:lang w:val="es-419" w:eastAsia="es-CO"/>
@@ -7840,7 +7814,7 @@
       <w:pPr>
         <w:pStyle w:val="Ttulo2"/>
       </w:pPr>
-      <w:bookmarkStart w:id="7" w:name="_Toc229413294"/>
+      <w:bookmarkStart w:id="7" w:name="_Toc229564287"/>
       <w:r>
         <w:lastRenderedPageBreak/>
         <w:t>Discapacidad y sus tipos</w:t>
@@ -8299,7 +8273,7 @@
       <w:pPr>
         <w:pStyle w:val="Ttulo2"/>
       </w:pPr>
-      <w:bookmarkStart w:id="8" w:name="_Toc229413295"/>
+      <w:bookmarkStart w:id="8" w:name="_Toc229564288"/>
       <w:r>
         <w:t>Normativa</w:t>
       </w:r>
@@ -9162,7 +9136,7 @@
       <w:pPr>
         <w:pStyle w:val="Ttulo1"/>
       </w:pPr>
-      <w:bookmarkStart w:id="9" w:name="_Toc229413296"/>
+      <w:bookmarkStart w:id="9" w:name="_Toc229564289"/>
       <w:r>
         <w:lastRenderedPageBreak/>
         <w:t>Servicio al cliente</w:t>
@@ -9364,7 +9338,7 @@
       <w:pPr>
         <w:pStyle w:val="Ttulo2"/>
       </w:pPr>
-      <w:bookmarkStart w:id="10" w:name="_Toc229413297"/>
+      <w:bookmarkStart w:id="10" w:name="_Toc229564290"/>
       <w:r>
         <w:t>Prestación del servicio al cliente</w:t>
       </w:r>
@@ -10447,7 +10421,7 @@
       <w:pPr>
         <w:pStyle w:val="Ttulo2"/>
       </w:pPr>
-      <w:bookmarkStart w:id="11" w:name="_Toc229413298"/>
+      <w:bookmarkStart w:id="11" w:name="_Toc229564291"/>
       <w:r>
         <w:lastRenderedPageBreak/>
         <w:t>Triángulo del servicio</w:t>
@@ -11242,7 +11216,7 @@
       <w:pPr>
         <w:pStyle w:val="Ttulo2"/>
       </w:pPr>
-      <w:bookmarkStart w:id="12" w:name="_Toc229413299"/>
+      <w:bookmarkStart w:id="12" w:name="_Toc229564292"/>
       <w:r>
         <w:t>Canales de atención en servicio al cliente</w:t>
       </w:r>
@@ -11313,7 +11287,7 @@
       <w:pPr>
         <w:pStyle w:val="Ttulo2"/>
       </w:pPr>
-      <w:bookmarkStart w:id="13" w:name="_Toc229413300"/>
+      <w:bookmarkStart w:id="13" w:name="_Toc229564293"/>
       <w:r>
         <w:t>Momentos de verdad</w:t>
       </w:r>
@@ -11407,17 +11381,29 @@
         <w:rPr>
           <w:lang w:val="es-419" w:eastAsia="es-CO"/>
         </w:rPr>
-        <w:t xml:space="preserve">      </w:t>
+        <w:t xml:space="preserve"> </w:t>
+      </w:r>
+      <w:r>
+        <w:rPr>
+          <w:lang w:val="es-419" w:eastAsia="es-CO"/>
+        </w:rPr>
+        <w:t xml:space="preserve"> </w:t>
+      </w:r>
+      <w:r>
+        <w:rPr>
+          <w:lang w:val="es-419" w:eastAsia="es-CO"/>
+        </w:rPr>
+        <w:t xml:space="preserve">     </w:t>
       </w:r>
       <w:r>
         <w:rPr>
           <w:noProof/>
         </w:rPr>
         <w:drawing>
-          <wp:inline distT="0" distB="0" distL="0" distR="0" wp14:anchorId="1B4006A2" wp14:editId="282AD850">
-            <wp:extent cx="4750130" cy="2670874"/>
-            <wp:effectExtent l="0" t="0" r="0" b="0"/>
-            <wp:docPr id="10" name="Imagen 10">
+          <wp:inline distT="0" distB="0" distL="0" distR="0" wp14:anchorId="4DF3C438" wp14:editId="20CBA820">
+            <wp:extent cx="3955311" cy="2223970"/>
+            <wp:effectExtent l="0" t="0" r="7620" b="5080"/>
+            <wp:docPr id="15" name="Imagen 15">
               <a:extLst xmlns:a="http://schemas.openxmlformats.org/drawingml/2006/main">
                 <a:ext uri="{C183D7F6-B498-43B3-948B-1728B52AA6E4}">
                   <adec:decorative xmlns:adec="http://schemas.microsoft.com/office/drawing/2017/decorative" val="1"/>
@@ -11431,7 +11417,7 @@
               <a:graphicData uri="http://schemas.openxmlformats.org/drawingml/2006/picture">
                 <pic:pic xmlns:pic="http://schemas.openxmlformats.org/drawingml/2006/picture">
                   <pic:nvPicPr>
-                    <pic:cNvPr id="10" name="Imagen 10">
+                    <pic:cNvPr id="15" name="Imagen 15">
                       <a:extLst>
                         <a:ext uri="{C183D7F6-B498-43B3-948B-1728B52AA6E4}">
                           <adec:decorative xmlns:adec="http://schemas.microsoft.com/office/drawing/2017/decorative" val="1"/>
@@ -11458,7 +11444,7 @@
                   <pic:spPr bwMode="auto">
                     <a:xfrm>
                       <a:off x="0" y="0"/>
-                      <a:ext cx="4790829" cy="2693758"/>
+                      <a:ext cx="3980584" cy="2238181"/>
                     </a:xfrm>
                     <a:prstGeom prst="rect">
                       <a:avLst/>
@@ -12079,7 +12065,7 @@
       <w:pPr>
         <w:pStyle w:val="Ttulo1"/>
       </w:pPr>
-      <w:bookmarkStart w:id="14" w:name="_Toc229413301"/>
+      <w:bookmarkStart w:id="14" w:name="_Toc229564294"/>
       <w:r>
         <w:lastRenderedPageBreak/>
         <w:t>Seguridad y salud en el trabajo (SST)</w:t>
@@ -13066,7 +13052,7 @@
       <w:pPr>
         <w:pStyle w:val="Ttulo2"/>
       </w:pPr>
-      <w:bookmarkStart w:id="15" w:name="_Toc229413302"/>
+      <w:bookmarkStart w:id="15" w:name="_Toc229564295"/>
       <w:r>
         <w:t>Factores de riesgos SST</w:t>
       </w:r>
@@ -13382,7 +13368,7 @@
       <w:pPr>
         <w:pStyle w:val="Ttulo2"/>
       </w:pPr>
-      <w:bookmarkStart w:id="18" w:name="_Toc229413303"/>
+      <w:bookmarkStart w:id="18" w:name="_Toc229564296"/>
       <w:r>
         <w:t>Manejo y control SST</w:t>
       </w:r>
@@ -13584,6 +13570,7 @@
       </w:pPr>
       <w:r>
         <w:rPr>
+          <w:noProof/>
           <w:lang w:val="es-419" w:eastAsia="es-CO"/>
         </w:rPr>
         <w:drawing>
@@ -13732,7 +13719,7 @@
       <w:pPr>
         <w:pStyle w:val="Titulosgenerales"/>
       </w:pPr>
-      <w:bookmarkStart w:id="19" w:name="_Toc229413304"/>
+      <w:bookmarkStart w:id="19" w:name="_Toc229564297"/>
       <w:bookmarkEnd w:id="16"/>
       <w:bookmarkEnd w:id="17"/>
       <w:r>
@@ -13769,6 +13756,7 @@
       </w:pPr>
       <w:r>
         <w:rPr>
+          <w:noProof/>
           <w:lang w:val="es-419" w:eastAsia="es-CO"/>
         </w:rPr>
         <w:drawing>
@@ -13819,7 +13807,7 @@
       <w:pPr>
         <w:pStyle w:val="Titulosgenerales"/>
       </w:pPr>
-      <w:bookmarkStart w:id="20" w:name="_Toc229413305"/>
+      <w:bookmarkStart w:id="20" w:name="_Toc229564298"/>
       <w:r>
         <w:lastRenderedPageBreak/>
         <w:t>Glosario</w:t>
@@ -14116,7 +14104,7 @@
       <w:pPr>
         <w:pStyle w:val="Titulosgenerales"/>
       </w:pPr>
-      <w:bookmarkStart w:id="21" w:name="_Toc229413306"/>
+      <w:bookmarkStart w:id="21" w:name="_Toc229564299"/>
       <w:r>
         <w:lastRenderedPageBreak/>
         <w:t>Referencias bibliográficas</w:t>
@@ -14399,7 +14387,7 @@
       <w:pPr>
         <w:pStyle w:val="Titulosgenerales"/>
       </w:pPr>
-      <w:bookmarkStart w:id="22" w:name="_Toc229413307"/>
+      <w:bookmarkStart w:id="22" w:name="_Toc229564300"/>
       <w:r>
         <w:lastRenderedPageBreak/>
         <w:t>C</w:t>
@@ -22415,17 +22403,6 @@
 </file>
 
 <file path=customXml/item1.xml><?xml version="1.0" encoding="utf-8"?>
-<p:properties xmlns:p="http://schemas.microsoft.com/office/2006/metadata/properties" xmlns:xsi="http://www.w3.org/2001/XMLSchema-instance" xmlns:pc="http://schemas.microsoft.com/office/infopath/2007/PartnerControls">
-  <documentManagement>
-    <TaxCatchAll xmlns="13c90a0b-73bc-4dc0-be5f-28d77b615beb" xsi:nil="true"/>
-    <lcf76f155ced4ddcb4097134ff3c332f xmlns="13c93bba-48ce-428c-bfe5-88b42c19b028">
-      <Terms xmlns="http://schemas.microsoft.com/office/infopath/2007/PartnerControls"/>
-    </lcf76f155ced4ddcb4097134ff3c332f>
-  </documentManagement>
-</p:properties>
-</file>
-
-<file path=customXml/item2.xml><?xml version="1.0" encoding="utf-8"?>
 <?mso-contentType ?>
 <FormTemplates xmlns="http://schemas.microsoft.com/sharepoint/v3/contenttype/forms">
   <Display>DocumentLibraryForm</Display>
@@ -22434,242 +22411,18 @@
 </FormTemplates>
 </file>
 
-<file path=customXml/item3.xml><?xml version="1.0" encoding="utf-8"?>
-<ct:contentTypeSchema xmlns:ct="http://schemas.microsoft.com/office/2006/metadata/contentType" xmlns:ma="http://schemas.microsoft.com/office/2006/metadata/properties/metaAttributes" ct:_="" ma:_="" ma:contentTypeName="Documento" ma:contentTypeID="0x0101006A81D6BD42E8DF4C91013959704817E1" ma:contentTypeVersion="15" ma:contentTypeDescription="Crear nuevo documento." ma:contentTypeScope="" ma:versionID="bf4f72ffd194f0963ff564daca6869f7">
-  <xsd:schema xmlns:xsd="http://www.w3.org/2001/XMLSchema" xmlns:xs="http://www.w3.org/2001/XMLSchema" xmlns:p="http://schemas.microsoft.com/office/2006/metadata/properties" xmlns:ns2="13c90a0b-73bc-4dc0-be5f-28d77b615beb" xmlns:ns3="13c93bba-48ce-428c-bfe5-88b42c19b028" targetNamespace="http://schemas.microsoft.com/office/2006/metadata/properties" ma:root="true" ma:fieldsID="8718d6f4873a5b1392a45044efa78385" ns2:_="" ns3:_="">
-    <xsd:import namespace="13c90a0b-73bc-4dc0-be5f-28d77b615beb"/>
-    <xsd:import namespace="13c93bba-48ce-428c-bfe5-88b42c19b028"/>
-    <xsd:element name="properties">
-      <xsd:complexType>
-        <xsd:sequence>
-          <xsd:element name="documentManagement">
-            <xsd:complexType>
-              <xsd:all>
-                <xsd:element ref="ns2:SharedWithUsers" minOccurs="0"/>
-                <xsd:element ref="ns2:SharedWithDetails" minOccurs="0"/>
-                <xsd:element ref="ns3:MediaServiceMetadata" minOccurs="0"/>
-                <xsd:element ref="ns3:MediaServiceFastMetadata" minOccurs="0"/>
-                <xsd:element ref="ns3:MediaServiceSearchProperties" minOccurs="0"/>
-                <xsd:element ref="ns3:MediaServiceObjectDetectorVersions" minOccurs="0"/>
-                <xsd:element ref="ns3:MediaServiceDateTaken" minOccurs="0"/>
-                <xsd:element ref="ns3:MediaServiceGenerationTime" minOccurs="0"/>
-                <xsd:element ref="ns3:MediaServiceEventHashCode" minOccurs="0"/>
-                <xsd:element ref="ns3:MediaLengthInSeconds" minOccurs="0"/>
-                <xsd:element ref="ns3:lcf76f155ced4ddcb4097134ff3c332f" minOccurs="0"/>
-                <xsd:element ref="ns2:TaxCatchAll" minOccurs="0"/>
-                <xsd:element ref="ns3:MediaServiceOCR" minOccurs="0"/>
-                <xsd:element ref="ns3:MediaServiceLocation" minOccurs="0"/>
-              </xsd:all>
-            </xsd:complexType>
-          </xsd:element>
-        </xsd:sequence>
-      </xsd:complexType>
-    </xsd:element>
-  </xsd:schema>
-  <xsd:schema xmlns:xsd="http://www.w3.org/2001/XMLSchema" xmlns:xs="http://www.w3.org/2001/XMLSchema" xmlns:dms="http://schemas.microsoft.com/office/2006/documentManagement/types" xmlns:pc="http://schemas.microsoft.com/office/infopath/2007/PartnerControls" targetNamespace="13c90a0b-73bc-4dc0-be5f-28d77b615beb" elementFormDefault="qualified">
-    <xsd:import namespace="http://schemas.microsoft.com/office/2006/documentManagement/types"/>
-    <xsd:import namespace="http://schemas.microsoft.com/office/infopath/2007/PartnerControls"/>
-    <xsd:element name="SharedWithUsers" ma:index="8" nillable="true" ma:displayName="Compartido con" ma:internalName="SharedWithUsers" ma:readOnly="true">
-      <xsd:complexType>
-        <xsd:complexContent>
-          <xsd:extension base="dms:UserMulti">
-            <xsd:sequence>
-              <xsd:element name="UserInfo" minOccurs="0" maxOccurs="unbounded">
-                <xsd:complexType>
-                  <xsd:sequence>
-                    <xsd:element name="DisplayName" type="xsd:string" minOccurs="0"/>
-                    <xsd:element name="AccountId" type="dms:UserId" minOccurs="0" nillable="true"/>
-                    <xsd:element name="AccountType" type="xsd:string" minOccurs="0"/>
-                  </xsd:sequence>
-                </xsd:complexType>
-              </xsd:element>
-            </xsd:sequence>
-          </xsd:extension>
-        </xsd:complexContent>
-      </xsd:complexType>
-    </xsd:element>
-    <xsd:element name="SharedWithDetails" ma:index="9" nillable="true" ma:displayName="Detalles de uso compartido" ma:internalName="SharedWithDetails" ma:readOnly="true">
-      <xsd:simpleType>
-        <xsd:restriction base="dms:Note">
-          <xsd:maxLength value="255"/>
-        </xsd:restriction>
-      </xsd:simpleType>
-    </xsd:element>
-    <xsd:element name="TaxCatchAll" ma:index="20" nillable="true" ma:displayName="Taxonomy Catch All Column" ma:hidden="true" ma:list="{a42ca037-5d13-4729-aeec-4237f141d2d6}" ma:internalName="TaxCatchAll" ma:showField="CatchAllData" ma:web="13c90a0b-73bc-4dc0-be5f-28d77b615beb">
-      <xsd:complexType>
-        <xsd:complexContent>
-          <xsd:extension base="dms:MultiChoiceLookup">
-            <xsd:sequence>
-              <xsd:element name="Value" type="dms:Lookup" maxOccurs="unbounded" minOccurs="0" nillable="true"/>
-            </xsd:sequence>
-          </xsd:extension>
-        </xsd:complexContent>
-      </xsd:complexType>
-    </xsd:element>
-  </xsd:schema>
-  <xsd:schema xmlns:xsd="http://www.w3.org/2001/XMLSchema" xmlns:xs="http://www.w3.org/2001/XMLSchema" xmlns:dms="http://schemas.microsoft.com/office/2006/documentManagement/types" xmlns:pc="http://schemas.microsoft.com/office/infopath/2007/PartnerControls" targetNamespace="13c93bba-48ce-428c-bfe5-88b42c19b028" elementFormDefault="qualified">
-    <xsd:import namespace="http://schemas.microsoft.com/office/2006/documentManagement/types"/>
-    <xsd:import namespace="http://schemas.microsoft.com/office/infopath/2007/PartnerControls"/>
-    <xsd:element name="MediaServiceMetadata" ma:index="10" nillable="true" ma:displayName="MediaServiceMetadata" ma:hidden="true" ma:internalName="MediaServiceMetadata" ma:readOnly="true">
-      <xsd:simpleType>
-        <xsd:restriction base="dms:Note"/>
-      </xsd:simpleType>
-    </xsd:element>
-    <xsd:element name="MediaServiceFastMetadata" ma:index="11" nillable="true" ma:displayName="MediaServiceFastMetadata" ma:hidden="true" ma:internalName="MediaServiceFastMetadata" ma:readOnly="true">
-      <xsd:simpleType>
-        <xsd:restriction base="dms:Note"/>
-      </xsd:simpleType>
-    </xsd:element>
-    <xsd:element name="MediaServiceSearchProperties" ma:index="12" nillable="true" ma:displayName="MediaServiceSearchProperties" ma:hidden="true" ma:internalName="MediaServiceSearchProperties" ma:readOnly="true">
-      <xsd:simpleType>
-        <xsd:restriction base="dms:Note"/>
-      </xsd:simpleType>
-    </xsd:element>
-    <xsd:element name="MediaServiceObjectDetectorVersions" ma:index="13" nillable="true" ma:displayName="MediaServiceObjectDetectorVersions" ma:hidden="true" ma:indexed="true" ma:internalName="MediaServiceObjectDetectorVersions" ma:readOnly="true">
-      <xsd:simpleType>
-        <xsd:restriction base="dms:Text"/>
-      </xsd:simpleType>
-    </xsd:element>
-    <xsd:element name="MediaServiceDateTaken" ma:index="14" nillable="true" ma:displayName="MediaServiceDateTaken" ma:hidden="true" ma:indexed="true" ma:internalName="MediaServiceDateTaken" ma:readOnly="true">
-      <xsd:simpleType>
-        <xsd:restriction base="dms:Text"/>
-      </xsd:simpleType>
-    </xsd:element>
-    <xsd:element name="MediaServiceGenerationTime" ma:index="15" nillable="true" ma:displayName="MediaServiceGenerationTime" ma:hidden="true" ma:internalName="MediaServiceGenerationTime" ma:readOnly="true">
-      <xsd:simpleType>
-        <xsd:restriction base="dms:Text"/>
-      </xsd:simpleType>
-    </xsd:element>
-    <xsd:element name="MediaServiceEventHashCode" ma:index="16" nillable="true" ma:displayName="MediaServiceEventHashCode" ma:hidden="true" ma:internalName="MediaServiceEventHashCode" ma:readOnly="true">
-      <xsd:simpleType>
-        <xsd:restriction base="dms:Text"/>
-      </xsd:simpleType>
-    </xsd:element>
-    <xsd:element name="MediaLengthInSeconds" ma:index="17" nillable="true" ma:displayName="MediaLengthInSeconds" ma:hidden="true" ma:internalName="MediaLengthInSeconds" ma:readOnly="true">
-      <xsd:simpleType>
-        <xsd:restriction base="dms:Unknown"/>
-      </xsd:simpleType>
-    </xsd:element>
-    <xsd:element name="lcf76f155ced4ddcb4097134ff3c332f" ma:index="19" nillable="true" ma:taxonomy="true" ma:internalName="lcf76f155ced4ddcb4097134ff3c332f" ma:taxonomyFieldName="MediaServiceImageTags" ma:displayName="Etiquetas de imagen" ma:readOnly="false" ma:fieldId="{5cf76f15-5ced-4ddc-b409-7134ff3c332f}" ma:taxonomyMulti="true" ma:sspId="d33c8c81-5745-4931-bcc4-c2aeafe86780" ma:termSetId="09814cd3-568e-fe90-9814-8d621ff8fb84" ma:anchorId="fba54fb3-c3e1-fe81-a776-ca4b69148c4d" ma:open="true" ma:isKeyword="false">
-      <xsd:complexType>
-        <xsd:sequence>
-          <xsd:element ref="pc:Terms" minOccurs="0" maxOccurs="1"/>
-        </xsd:sequence>
-      </xsd:complexType>
-    </xsd:element>
-    <xsd:element name="MediaServiceOCR" ma:index="21" nillable="true" ma:displayName="Extracted Text" ma:internalName="MediaServiceOCR" ma:readOnly="true">
-      <xsd:simpleType>
-        <xsd:restriction base="dms:Note">
-          <xsd:maxLength value="255"/>
-        </xsd:restriction>
-      </xsd:simpleType>
-    </xsd:element>
-    <xsd:element name="MediaServiceLocation" ma:index="22" nillable="true" ma:displayName="Location" ma:description="" ma:indexed="true" ma:internalName="MediaServiceLocation" ma:readOnly="true">
-      <xsd:simpleType>
-        <xsd:restriction base="dms:Text"/>
-      </xsd:simpleType>
-    </xsd:element>
-  </xsd:schema>
-  <xsd:schema xmlns="http://schemas.openxmlformats.org/package/2006/metadata/core-properties" xmlns:xsd="http://www.w3.org/2001/XMLSchema" xmlns:xsi="http://www.w3.org/2001/XMLSchema-instance" xmlns:dc="http://purl.org/dc/elements/1.1/" xmlns:dcterms="http://purl.org/dc/terms/" xmlns:odoc="http://schemas.microsoft.com/internal/obd" targetNamespace="http://schemas.openxmlformats.org/package/2006/metadata/core-properties" elementFormDefault="qualified" attributeFormDefault="unqualified" blockDefault="#all">
-    <xsd:import namespace="http://purl.org/dc/elements/1.1/" schemaLocation="http://dublincore.org/schemas/xmls/qdc/2003/04/02/dc.xsd"/>
-    <xsd:import namespace="http://purl.org/dc/terms/" schemaLocation="http://dublincore.org/schemas/xmls/qdc/2003/04/02/dcterms.xsd"/>
-    <xsd:element name="coreProperties" type="CT_coreProperties"/>
-    <xsd:complexType name="CT_coreProperties">
-      <xsd:all>
-        <xsd:element ref="dc:creator" minOccurs="0" maxOccurs="1"/>
-        <xsd:element ref="dcterms:created" minOccurs="0" maxOccurs="1"/>
-        <xsd:element ref="dc:identifier" minOccurs="0" maxOccurs="1"/>
-        <xsd:element name="contentType" minOccurs="0" maxOccurs="1" type="xsd:string" ma:index="0" ma:displayName="Tipo de contenido"/>
-        <xsd:element ref="dc:title" minOccurs="0" maxOccurs="1" ma:index="4" ma:displayName="Título"/>
-        <xsd:element ref="dc:subject" minOccurs="0" maxOccurs="1"/>
-        <xsd:element ref="dc:description" minOccurs="0" maxOccurs="1"/>
-        <xsd:element name="keywords" minOccurs="0" maxOccurs="1" type="xsd:string"/>
-        <xsd:element ref="dc:language" minOccurs="0" maxOccurs="1"/>
-        <xsd:element name="category" minOccurs="0" maxOccurs="1" type="xsd:string"/>
-        <xsd:element name="version" minOccurs="0" maxOccurs="1" type="xsd:string"/>
-        <xsd:element name="revision" minOccurs="0" maxOccurs="1" type="xsd:string">
-          <xsd:annotation>
-            <xsd:documentation>
-                        This value indicates the number of saves or revisions. The application is responsible for updating this value after each revision.
-                    </xsd:documentation>
-          </xsd:annotation>
-        </xsd:element>
-        <xsd:element name="lastModifiedBy" minOccurs="0" maxOccurs="1" type="xsd:string"/>
-        <xsd:element ref="dcterms:modified" minOccurs="0" maxOccurs="1"/>
-        <xsd:element name="contentStatus" minOccurs="0" maxOccurs="1" type="xsd:string"/>
-      </xsd:all>
-    </xsd:complexType>
-  </xsd:schema>
-  <xs:schema xmlns:pc="http://schemas.microsoft.com/office/infopath/2007/PartnerControls" xmlns:xs="http://www.w3.org/2001/XMLSchema" targetNamespace="http://schemas.microsoft.com/office/infopath/2007/PartnerControls" elementFormDefault="qualified" attributeFormDefault="unqualified">
-    <xs:element name="Person">
-      <xs:complexType>
-        <xs:sequence>
-          <xs:element ref="pc:DisplayName" minOccurs="0"/>
-          <xs:element ref="pc:AccountId" minOccurs="0"/>
-          <xs:element ref="pc:AccountType" minOccurs="0"/>
-        </xs:sequence>
-      </xs:complexType>
-    </xs:element>
-    <xs:element name="DisplayName" type="xs:string"/>
-    <xs:element name="AccountId" type="xs:string"/>
-    <xs:element name="AccountType" type="xs:string"/>
-    <xs:element name="BDCAssociatedEntity">
-      <xs:complexType>
-        <xs:sequence>
-          <xs:element ref="pc:BDCEntity" minOccurs="0" maxOccurs="unbounded"/>
-        </xs:sequence>
-        <xs:attribute ref="pc:EntityNamespace"/>
-        <xs:attribute ref="pc:EntityName"/>
-        <xs:attribute ref="pc:SystemInstanceName"/>
-        <xs:attribute ref="pc:AssociationName"/>
-      </xs:complexType>
-    </xs:element>
-    <xs:attribute name="EntityNamespace" type="xs:string"/>
-    <xs:attribute name="EntityName" type="xs:string"/>
-    <xs:attribute name="SystemInstanceName" type="xs:string"/>
-    <xs:attribute name="AssociationName" type="xs:string"/>
-    <xs:element name="BDCEntity">
-      <xs:complexType>
-        <xs:sequence>
-          <xs:element ref="pc:EntityDisplayName" minOccurs="0"/>
-          <xs:element ref="pc:EntityInstanceReference" minOccurs="0"/>
-          <xs:element ref="pc:EntityId1" minOccurs="0"/>
-          <xs:element ref="pc:EntityId2" minOccurs="0"/>
-          <xs:element ref="pc:EntityId3" minOccurs="0"/>
-          <xs:element ref="pc:EntityId4" minOccurs="0"/>
-          <xs:element ref="pc:EntityId5" minOccurs="0"/>
-        </xs:sequence>
-      </xs:complexType>
-    </xs:element>
-    <xs:element name="EntityDisplayName" type="xs:string"/>
-    <xs:element name="EntityInstanceReference" type="xs:string"/>
-    <xs:element name="EntityId1" type="xs:string"/>
-    <xs:element name="EntityId2" type="xs:string"/>
-    <xs:element name="EntityId3" type="xs:string"/>
-    <xs:element name="EntityId4" type="xs:string"/>
-    <xs:element name="EntityId5" type="xs:string"/>
-    <xs:element name="Terms">
-      <xs:complexType>
-        <xs:sequence>
-          <xs:element ref="pc:TermInfo" minOccurs="0" maxOccurs="unbounded"/>
-        </xs:sequence>
-      </xs:complexType>
-    </xs:element>
-    <xs:element name="TermInfo">
-      <xs:complexType>
-        <xs:sequence>
-          <xs:element ref="pc:TermName" minOccurs="0"/>
-          <xs:element ref="pc:TermId" minOccurs="0"/>
-        </xs:sequence>
-      </xs:complexType>
-    </xs:element>
-    <xs:element name="TermName" type="xs:string"/>
-    <xs:element name="TermId" type="xs:string"/>
-  </xs:schema>
-</ct:contentTypeSchema>
+<file path=customXml/item2.xml><?xml version="1.0" encoding="utf-8"?>
+<p:properties xmlns:p="http://schemas.microsoft.com/office/2006/metadata/properties" xmlns:xsi="http://www.w3.org/2001/XMLSchema-instance" xmlns:pc="http://schemas.microsoft.com/office/infopath/2007/PartnerControls">
+  <documentManagement>
+    <TaxCatchAll xmlns="adccf511-daff-4bcb-9072-914cedbf4c7e" xsi:nil="true"/>
+    <lcf76f155ced4ddcb4097134ff3c332f xmlns="a70d3c18-0869-45a1-9f75-4b4b8f0f32be">
+      <Terms xmlns="http://schemas.microsoft.com/office/infopath/2007/PartnerControls"/>
+    </lcf76f155ced4ddcb4097134ff3c332f>
+  </documentManagement>
+</p:properties>
 </file>
 
-<file path=customXml/item4.xml><?xml version="1.0" encoding="utf-8"?>
+<file path=customXml/item3.xml><?xml version="1.0" encoding="utf-8"?>
 <b:Sources xmlns:b="http://schemas.openxmlformats.org/officeDocument/2006/bibliography" xmlns="http://schemas.openxmlformats.org/officeDocument/2006/bibliography" SelectedStyle="\APASixthEditionOfficeOnline.xsl" StyleName="APA" Version="6">
   <b:Source>
     <b:Tag>Mue12</b:Tag>
@@ -23180,7 +22933,216 @@
 </b:Sources>
 </file>
 
+<file path=customXml/item4.xml><?xml version="1.0" encoding="utf-8"?>
+<ct:contentTypeSchema xmlns:ct="http://schemas.microsoft.com/office/2006/metadata/contentType" xmlns:ma="http://schemas.microsoft.com/office/2006/metadata/properties/metaAttributes" ct:_="" ma:_="" ma:contentTypeName="Documento" ma:contentTypeID="0x010100FC2B1768DD5A774EB396CCAB0DE361C1" ma:contentTypeVersion="12" ma:contentTypeDescription="Crear nuevo documento." ma:contentTypeScope="" ma:versionID="d4a546b22d2924edabf51241cf3422b8">
+  <xsd:schema xmlns:xsd="http://www.w3.org/2001/XMLSchema" xmlns:xs="http://www.w3.org/2001/XMLSchema" xmlns:p="http://schemas.microsoft.com/office/2006/metadata/properties" xmlns:ns2="a70d3c18-0869-45a1-9f75-4b4b8f0f32be" xmlns:ns3="adccf511-daff-4bcb-9072-914cedbf4c7e" targetNamespace="http://schemas.microsoft.com/office/2006/metadata/properties" ma:root="true" ma:fieldsID="e29002b2d9ca820e89c57fc59ec70c79" ns2:_="" ns3:_="">
+    <xsd:import namespace="a70d3c18-0869-45a1-9f75-4b4b8f0f32be"/>
+    <xsd:import namespace="adccf511-daff-4bcb-9072-914cedbf4c7e"/>
+    <xsd:element name="properties">
+      <xsd:complexType>
+        <xsd:sequence>
+          <xsd:element name="documentManagement">
+            <xsd:complexType>
+              <xsd:all>
+                <xsd:element ref="ns2:MediaServiceMetadata" minOccurs="0"/>
+                <xsd:element ref="ns2:MediaServiceFastMetadata" minOccurs="0"/>
+                <xsd:element ref="ns2:MediaServiceSearchProperties" minOccurs="0"/>
+                <xsd:element ref="ns2:MediaServiceDateTaken" minOccurs="0"/>
+                <xsd:element ref="ns2:MediaServiceGenerationTime" minOccurs="0"/>
+                <xsd:element ref="ns2:MediaServiceEventHashCode" minOccurs="0"/>
+                <xsd:element ref="ns2:MediaLengthInSeconds" minOccurs="0"/>
+                <xsd:element ref="ns2:lcf76f155ced4ddcb4097134ff3c332f" minOccurs="0"/>
+                <xsd:element ref="ns3:TaxCatchAll" minOccurs="0"/>
+                <xsd:element ref="ns2:MediaServiceOCR" minOccurs="0"/>
+                <xsd:element ref="ns2:MediaServiceBillingMetadata" minOccurs="0"/>
+              </xsd:all>
+            </xsd:complexType>
+          </xsd:element>
+        </xsd:sequence>
+      </xsd:complexType>
+    </xsd:element>
+  </xsd:schema>
+  <xsd:schema xmlns:xsd="http://www.w3.org/2001/XMLSchema" xmlns:xs="http://www.w3.org/2001/XMLSchema" xmlns:dms="http://schemas.microsoft.com/office/2006/documentManagement/types" xmlns:pc="http://schemas.microsoft.com/office/infopath/2007/PartnerControls" targetNamespace="a70d3c18-0869-45a1-9f75-4b4b8f0f32be" elementFormDefault="qualified">
+    <xsd:import namespace="http://schemas.microsoft.com/office/2006/documentManagement/types"/>
+    <xsd:import namespace="http://schemas.microsoft.com/office/infopath/2007/PartnerControls"/>
+    <xsd:element name="MediaServiceMetadata" ma:index="8" nillable="true" ma:displayName="MediaServiceMetadata" ma:hidden="true" ma:internalName="MediaServiceMetadata" ma:readOnly="true">
+      <xsd:simpleType>
+        <xsd:restriction base="dms:Note"/>
+      </xsd:simpleType>
+    </xsd:element>
+    <xsd:element name="MediaServiceFastMetadata" ma:index="9" nillable="true" ma:displayName="MediaServiceFastMetadata" ma:hidden="true" ma:internalName="MediaServiceFastMetadata" ma:readOnly="true">
+      <xsd:simpleType>
+        <xsd:restriction base="dms:Note"/>
+      </xsd:simpleType>
+    </xsd:element>
+    <xsd:element name="MediaServiceSearchProperties" ma:index="10" nillable="true" ma:displayName="MediaServiceSearchProperties" ma:hidden="true" ma:internalName="MediaServiceSearchProperties" ma:readOnly="true">
+      <xsd:simpleType>
+        <xsd:restriction base="dms:Note"/>
+      </xsd:simpleType>
+    </xsd:element>
+    <xsd:element name="MediaServiceDateTaken" ma:index="11" nillable="true" ma:displayName="MediaServiceDateTaken" ma:hidden="true" ma:indexed="true" ma:internalName="MediaServiceDateTaken" ma:readOnly="true">
+      <xsd:simpleType>
+        <xsd:restriction base="dms:Text"/>
+      </xsd:simpleType>
+    </xsd:element>
+    <xsd:element name="MediaServiceGenerationTime" ma:index="12" nillable="true" ma:displayName="MediaServiceGenerationTime" ma:hidden="true" ma:internalName="MediaServiceGenerationTime" ma:readOnly="true">
+      <xsd:simpleType>
+        <xsd:restriction base="dms:Text"/>
+      </xsd:simpleType>
+    </xsd:element>
+    <xsd:element name="MediaServiceEventHashCode" ma:index="13" nillable="true" ma:displayName="MediaServiceEventHashCode" ma:hidden="true" ma:internalName="MediaServiceEventHashCode" ma:readOnly="true">
+      <xsd:simpleType>
+        <xsd:restriction base="dms:Text"/>
+      </xsd:simpleType>
+    </xsd:element>
+    <xsd:element name="MediaLengthInSeconds" ma:index="14" nillable="true" ma:displayName="MediaLengthInSeconds" ma:hidden="true" ma:internalName="MediaLengthInSeconds" ma:readOnly="true">
+      <xsd:simpleType>
+        <xsd:restriction base="dms:Unknown"/>
+      </xsd:simpleType>
+    </xsd:element>
+    <xsd:element name="lcf76f155ced4ddcb4097134ff3c332f" ma:index="16" nillable="true" ma:taxonomy="true" ma:internalName="lcf76f155ced4ddcb4097134ff3c332f" ma:taxonomyFieldName="MediaServiceImageTags" ma:displayName="Etiquetas de imagen" ma:readOnly="false" ma:fieldId="{5cf76f15-5ced-4ddc-b409-7134ff3c332f}" ma:taxonomyMulti="true" ma:sspId="d33c8c81-5745-4931-bcc4-c2aeafe86780" ma:termSetId="09814cd3-568e-fe90-9814-8d621ff8fb84" ma:anchorId="fba54fb3-c3e1-fe81-a776-ca4b69148c4d" ma:open="true" ma:isKeyword="false">
+      <xsd:complexType>
+        <xsd:sequence>
+          <xsd:element ref="pc:Terms" minOccurs="0" maxOccurs="1"/>
+        </xsd:sequence>
+      </xsd:complexType>
+    </xsd:element>
+    <xsd:element name="MediaServiceOCR" ma:index="18" nillable="true" ma:displayName="Extracted Text" ma:internalName="MediaServiceOCR" ma:readOnly="true">
+      <xsd:simpleType>
+        <xsd:restriction base="dms:Note">
+          <xsd:maxLength value="255"/>
+        </xsd:restriction>
+      </xsd:simpleType>
+    </xsd:element>
+    <xsd:element name="MediaServiceBillingMetadata" ma:index="19" nillable="true" ma:displayName="MediaServiceBillingMetadata" ma:hidden="true" ma:internalName="MediaServiceBillingMetadata" ma:readOnly="true">
+      <xsd:simpleType>
+        <xsd:restriction base="dms:Note"/>
+      </xsd:simpleType>
+    </xsd:element>
+  </xsd:schema>
+  <xsd:schema xmlns:xsd="http://www.w3.org/2001/XMLSchema" xmlns:xs="http://www.w3.org/2001/XMLSchema" xmlns:dms="http://schemas.microsoft.com/office/2006/documentManagement/types" xmlns:pc="http://schemas.microsoft.com/office/infopath/2007/PartnerControls" targetNamespace="adccf511-daff-4bcb-9072-914cedbf4c7e" elementFormDefault="qualified">
+    <xsd:import namespace="http://schemas.microsoft.com/office/2006/documentManagement/types"/>
+    <xsd:import namespace="http://schemas.microsoft.com/office/infopath/2007/PartnerControls"/>
+    <xsd:element name="TaxCatchAll" ma:index="17" nillable="true" ma:displayName="Taxonomy Catch All Column" ma:hidden="true" ma:list="{d55fdbc5-1632-489d-aeea-ba6fd7407963}" ma:internalName="TaxCatchAll" ma:showField="CatchAllData" ma:web="adccf511-daff-4bcb-9072-914cedbf4c7e">
+      <xsd:complexType>
+        <xsd:complexContent>
+          <xsd:extension base="dms:MultiChoiceLookup">
+            <xsd:sequence>
+              <xsd:element name="Value" type="dms:Lookup" maxOccurs="unbounded" minOccurs="0" nillable="true"/>
+            </xsd:sequence>
+          </xsd:extension>
+        </xsd:complexContent>
+      </xsd:complexType>
+    </xsd:element>
+  </xsd:schema>
+  <xsd:schema xmlns="http://schemas.openxmlformats.org/package/2006/metadata/core-properties" xmlns:xsd="http://www.w3.org/2001/XMLSchema" xmlns:xsi="http://www.w3.org/2001/XMLSchema-instance" xmlns:dc="http://purl.org/dc/elements/1.1/" xmlns:dcterms="http://purl.org/dc/terms/" xmlns:odoc="http://schemas.microsoft.com/internal/obd" targetNamespace="http://schemas.openxmlformats.org/package/2006/metadata/core-properties" elementFormDefault="qualified" attributeFormDefault="unqualified" blockDefault="#all">
+    <xsd:import namespace="http://purl.org/dc/elements/1.1/" schemaLocation="http://dublincore.org/schemas/xmls/qdc/2003/04/02/dc.xsd"/>
+    <xsd:import namespace="http://purl.org/dc/terms/" schemaLocation="http://dublincore.org/schemas/xmls/qdc/2003/04/02/dcterms.xsd"/>
+    <xsd:element name="coreProperties" type="CT_coreProperties"/>
+    <xsd:complexType name="CT_coreProperties">
+      <xsd:all>
+        <xsd:element ref="dc:creator" minOccurs="0" maxOccurs="1"/>
+        <xsd:element ref="dcterms:created" minOccurs="0" maxOccurs="1"/>
+        <xsd:element ref="dc:identifier" minOccurs="0" maxOccurs="1"/>
+        <xsd:element name="contentType" minOccurs="0" maxOccurs="1" type="xsd:string" ma:index="0" ma:displayName="Tipo de contenido"/>
+        <xsd:element ref="dc:title" minOccurs="0" maxOccurs="1" ma:index="4" ma:displayName="Título"/>
+        <xsd:element ref="dc:subject" minOccurs="0" maxOccurs="1"/>
+        <xsd:element ref="dc:description" minOccurs="0" maxOccurs="1"/>
+        <xsd:element name="keywords" minOccurs="0" maxOccurs="1" type="xsd:string"/>
+        <xsd:element ref="dc:language" minOccurs="0" maxOccurs="1"/>
+        <xsd:element name="category" minOccurs="0" maxOccurs="1" type="xsd:string"/>
+        <xsd:element name="version" minOccurs="0" maxOccurs="1" type="xsd:string"/>
+        <xsd:element name="revision" minOccurs="0" maxOccurs="1" type="xsd:string">
+          <xsd:annotation>
+            <xsd:documentation>
+                        This value indicates the number of saves or revisions. The application is responsible for updating this value after each revision.
+                    </xsd:documentation>
+          </xsd:annotation>
+        </xsd:element>
+        <xsd:element name="lastModifiedBy" minOccurs="0" maxOccurs="1" type="xsd:string"/>
+        <xsd:element ref="dcterms:modified" minOccurs="0" maxOccurs="1"/>
+        <xsd:element name="contentStatus" minOccurs="0" maxOccurs="1" type="xsd:string"/>
+      </xsd:all>
+    </xsd:complexType>
+  </xsd:schema>
+  <xs:schema xmlns:pc="http://schemas.microsoft.com/office/infopath/2007/PartnerControls" xmlns:xs="http://www.w3.org/2001/XMLSchema" targetNamespace="http://schemas.microsoft.com/office/infopath/2007/PartnerControls" elementFormDefault="qualified" attributeFormDefault="unqualified">
+    <xs:element name="Person">
+      <xs:complexType>
+        <xs:sequence>
+          <xs:element ref="pc:DisplayName" minOccurs="0"/>
+          <xs:element ref="pc:AccountId" minOccurs="0"/>
+          <xs:element ref="pc:AccountType" minOccurs="0"/>
+        </xs:sequence>
+      </xs:complexType>
+    </xs:element>
+    <xs:element name="DisplayName" type="xs:string"/>
+    <xs:element name="AccountId" type="xs:string"/>
+    <xs:element name="AccountType" type="xs:string"/>
+    <xs:element name="BDCAssociatedEntity">
+      <xs:complexType>
+        <xs:sequence>
+          <xs:element ref="pc:BDCEntity" minOccurs="0" maxOccurs="unbounded"/>
+        </xs:sequence>
+        <xs:attribute ref="pc:EntityNamespace"/>
+        <xs:attribute ref="pc:EntityName"/>
+        <xs:attribute ref="pc:SystemInstanceName"/>
+        <xs:attribute ref="pc:AssociationName"/>
+      </xs:complexType>
+    </xs:element>
+    <xs:attribute name="EntityNamespace" type="xs:string"/>
+    <xs:attribute name="EntityName" type="xs:string"/>
+    <xs:attribute name="SystemInstanceName" type="xs:string"/>
+    <xs:attribute name="AssociationName" type="xs:string"/>
+    <xs:element name="BDCEntity">
+      <xs:complexType>
+        <xs:sequence>
+          <xs:element ref="pc:EntityDisplayName" minOccurs="0"/>
+          <xs:element ref="pc:EntityInstanceReference" minOccurs="0"/>
+          <xs:element ref="pc:EntityId1" minOccurs="0"/>
+          <xs:element ref="pc:EntityId2" minOccurs="0"/>
+          <xs:element ref="pc:EntityId3" minOccurs="0"/>
+          <xs:element ref="pc:EntityId4" minOccurs="0"/>
+          <xs:element ref="pc:EntityId5" minOccurs="0"/>
+        </xs:sequence>
+      </xs:complexType>
+    </xs:element>
+    <xs:element name="EntityDisplayName" type="xs:string"/>
+    <xs:element name="EntityInstanceReference" type="xs:string"/>
+    <xs:element name="EntityId1" type="xs:string"/>
+    <xs:element name="EntityId2" type="xs:string"/>
+    <xs:element name="EntityId3" type="xs:string"/>
+    <xs:element name="EntityId4" type="xs:string"/>
+    <xs:element name="EntityId5" type="xs:string"/>
+    <xs:element name="Terms">
+      <xs:complexType>
+        <xs:sequence>
+          <xs:element ref="pc:TermInfo" minOccurs="0" maxOccurs="unbounded"/>
+        </xs:sequence>
+      </xs:complexType>
+    </xs:element>
+    <xs:element name="TermInfo">
+      <xs:complexType>
+        <xs:sequence>
+          <xs:element ref="pc:TermName" minOccurs="0"/>
+          <xs:element ref="pc:TermId" minOccurs="0"/>
+        </xs:sequence>
+      </xs:complexType>
+    </xs:element>
+    <xs:element name="TermName" type="xs:string"/>
+    <xs:element name="TermId" type="xs:string"/>
+  </xs:schema>
+</ct:contentTypeSchema>
+</file>
+
 <file path=customXml/itemProps1.xml><?xml version="1.0" encoding="utf-8"?>
+<ds:datastoreItem xmlns:ds="http://schemas.openxmlformats.org/officeDocument/2006/customXml" ds:itemID="{81CBDEC1-3B00-44ED-AD36-0268077980BA}">
+  <ds:schemaRefs>
+    <ds:schemaRef ds:uri="http://schemas.microsoft.com/sharepoint/v3/contenttype/forms"/>
+  </ds:schemaRefs>
+</ds:datastoreItem>
+</file>
+
+<file path=customXml/itemProps2.xml><?xml version="1.0" encoding="utf-8"?>
 <ds:datastoreItem xmlns:ds="http://schemas.openxmlformats.org/officeDocument/2006/customXml" ds:itemID="{1145D752-ACC1-45E1-AB53-0C756F67FC7F}">
   <ds:schemaRefs>
     <ds:schemaRef ds:uri="http://schemas.microsoft.com/office/2006/metadata/properties"/>
@@ -23191,22 +23153,29 @@
 </ds:datastoreItem>
 </file>
 
-<file path=customXml/itemProps2.xml><?xml version="1.0" encoding="utf-8"?>
-<ds:datastoreItem xmlns:ds="http://schemas.openxmlformats.org/officeDocument/2006/customXml" ds:itemID="{81CBDEC1-3B00-44ED-AD36-0268077980BA}">
-  <ds:schemaRefs>
-    <ds:schemaRef ds:uri="http://schemas.microsoft.com/sharepoint/v3/contenttype/forms"/>
-  </ds:schemaRefs>
-</ds:datastoreItem>
-</file>
-
 <file path=customXml/itemProps3.xml><?xml version="1.0" encoding="utf-8"?>
-<ds:datastoreItem xmlns:ds="http://schemas.openxmlformats.org/officeDocument/2006/customXml" ds:itemID="{39F49E34-3471-4F32-A407-B861BDD8DE47}"/>
-</file>
-
-<file path=customXml/itemProps4.xml><?xml version="1.0" encoding="utf-8"?>
 <ds:datastoreItem xmlns:ds="http://schemas.openxmlformats.org/officeDocument/2006/customXml" ds:itemID="{84F3832F-79D0-40EC-924E-4EC5D33B7AFB}">
   <ds:schemaRefs>
     <ds:schemaRef ds:uri="http://schemas.openxmlformats.org/officeDocument/2006/bibliography"/>
   </ds:schemaRefs>
 </ds:datastoreItem>
+</file>
+
+<file path=customXml/itemProps4.xml><?xml version="1.0" encoding="utf-8"?>
+<ds:datastoreItem xmlns:ds="http://schemas.openxmlformats.org/officeDocument/2006/customXml" ds:itemID="{996434B9-CC1E-4468-A086-AA07C2AF1350}">
+  <ds:schemaRefs>
+    <ds:schemaRef ds:uri="http://schemas.microsoft.com/office/2006/metadata/contentType"/>
+    <ds:schemaRef ds:uri="http://schemas.microsoft.com/office/2006/metadata/properties/metaAttributes"/>
+    <ds:schemaRef ds:uri="http://www.w3.org/2001/XMLSchema"/>
+    <ds:schemaRef ds:uri="http://schemas.microsoft.com/office/2006/metadata/properties"/>
+    <ds:schemaRef ds:uri="a70d3c18-0869-45a1-9f75-4b4b8f0f32be"/>
+    <ds:schemaRef ds:uri="adccf511-daff-4bcb-9072-914cedbf4c7e"/>
+    <ds:schemaRef ds:uri="http://schemas.microsoft.com/office/2006/documentManagement/types"/>
+    <ds:schemaRef ds:uri="http://schemas.microsoft.com/office/infopath/2007/PartnerControls"/>
+    <ds:schemaRef ds:uri="http://schemas.openxmlformats.org/package/2006/metadata/core-properties"/>
+    <ds:schemaRef ds:uri="http://purl.org/dc/elements/1.1/"/>
+    <ds:schemaRef ds:uri="http://purl.org/dc/terms/"/>
+    <ds:schemaRef ds:uri="http://schemas.microsoft.com/internal/obd"/>
+  </ds:schemaRefs>
+</ds:datastoreItem>
 </file>
</xml_diff>